<commit_message>
Kalan [CHECK] eşlemeleri doğrulandı
- ISO/IEC 42001 Annex A atıfları doğru numaralandırmayla teyit edildi ve
  kontrol adları eklendi (A.7.3, A.10.3, A.4.2, A.8.4, A.9.2); alt kontrol
  belirsizlikleri giderildi (HYG-ING-01 → A.7.2/A.7.6, HYG-ING-04 → A.6.2.4)
- Zayıf atıflar değiştirildi: TRA-ING-01 GDPR Art. 30 → ISO A.6.2.8;
  G-POL-02 AI Act Art. 26(1) ve G-INV-02 ISO A.9.2 kaldırıldı;
  G-RSK-02 NIST MAP 1.5 → MAP 1
- EU AI Act Art. 9, 26(2), 27 kapsamları; DORA Art. 28 / 28(8);
  BDDK Bilgi Sistemleri Yönetmeliği md. 25; KVKK md. 12(2), md. 16;
  SOC 2 CC6.1; TPL-11 GDPR Art. 35(7) asgari içerik
- 02 özeti, şablon README'si, inceleme tablosu ve TPL-11 Word sürümü güncellendi

Co-Authored-By: Claude Opus 5.5 <noreply@anthropic.com>
Claude-Session: https://claude.ai/code/session_01RaFMgY52inRvN44BSaYeeZ
</commit_message>
<xml_diff>
--- a/templates/docx/TPL-11-ai-kisisel-veri-etki-degerlendirmesi.docx
+++ b/templates/docx/TPL-11-ai-kisisel-veri-etki-degerlendirmesi.docx
@@ -46,20 +46,20 @@
         <w:t xml:space="preserve">Değerlendirmesi</w:t>
       </w:r>
     </w:p>
+    <w:bookmarkStart w:id="20" w:name="sistem-ve-işleme"/>
     <w:p>
       <w:pPr>
         <w:pStyle w:val="Heading1"/>
       </w:pPr>
-      <w:bookmarkStart w:id="20" w:name="sistem-ve-işleme"/>
       <w:r>
         <w:t xml:space="preserve">1. Sistem ve işleme</w:t>
       </w:r>
-      <w:bookmarkEnd w:id="20"/>
     </w:p>
     <w:tbl>
       <w:tblPr>
         <w:tblStyle w:val="Table"/>
-        <w:tblLook w:firstRow="0"/>
+        <w:tblLook w:firstRow="0" w:lastRow="0" w:firstColumn="0" w:lastColumn="0" w:noHBand="0" w:noVBand="0" w:val="0000"/>
+        <w:jc w:val="start"/>
         <w:tblW w:w="9600" w:type="dxa"/>
         <w:tblLayout w:type="fixed"/>
         <w:tblBorders>
@@ -71,9 +71,15 @@
           <w:insideV w:val="single" w:sz="4" w:color="8A9BB0"/>
         </w:tblBorders>
       </w:tblPr>
-      <w:tblGrid/>
+      <w:tblGrid>
+        <w:gridCol w:w="5074"/>
+        <w:gridCol w:w="4525"/>
+      </w:tblGrid>
       <w:tr>
         <w:tc>
+          <w:tcPr>
+            <w:tcW w:type="dxa" w:w="5074"/>
+          </w:tcPr>
           <w:p>
             <w:pPr>
               <w:pStyle w:val="Compact"/>
@@ -85,11 +91,21 @@
           </w:p>
         </w:tc>
         <w:tc>
-          <w:p/>
+          <w:tcPr>
+            <w:tcW w:type="dxa" w:w="4525"/>
+          </w:tcPr>
+          <w:p>
+            <w:pPr>
+              <w:pStyle w:val="Compact"/>
+            </w:pPr>
+          </w:p>
         </w:tc>
       </w:tr>
       <w:tr>
         <w:tc>
+          <w:tcPr>
+            <w:tcW w:type="dxa" w:w="5074"/>
+          </w:tcPr>
           <w:p>
             <w:pPr>
               <w:pStyle w:val="Compact"/>
@@ -101,11 +117,21 @@
           </w:p>
         </w:tc>
         <w:tc>
-          <w:p/>
+          <w:tcPr>
+            <w:tcW w:type="dxa" w:w="4525"/>
+          </w:tcPr>
+          <w:p>
+            <w:pPr>
+              <w:pStyle w:val="Compact"/>
+            </w:pPr>
+          </w:p>
         </w:tc>
       </w:tr>
       <w:tr>
         <w:tc>
+          <w:tcPr>
+            <w:tcW w:type="dxa" w:w="5074"/>
+          </w:tcPr>
           <w:p>
             <w:pPr>
               <w:pStyle w:val="Compact"/>
@@ -117,11 +143,21 @@
           </w:p>
         </w:tc>
         <w:tc>
-          <w:p/>
+          <w:tcPr>
+            <w:tcW w:type="dxa" w:w="4525"/>
+          </w:tcPr>
+          <w:p>
+            <w:pPr>
+              <w:pStyle w:val="Compact"/>
+            </w:pPr>
+          </w:p>
         </w:tc>
       </w:tr>
       <w:tr>
         <w:tc>
+          <w:tcPr>
+            <w:tcW w:type="dxa" w:w="5074"/>
+          </w:tcPr>
           <w:p>
             <w:pPr>
               <w:pStyle w:val="Compact"/>
@@ -133,11 +169,21 @@
           </w:p>
         </w:tc>
         <w:tc>
-          <w:p/>
+          <w:tcPr>
+            <w:tcW w:type="dxa" w:w="4525"/>
+          </w:tcPr>
+          <w:p>
+            <w:pPr>
+              <w:pStyle w:val="Compact"/>
+            </w:pPr>
+          </w:p>
         </w:tc>
       </w:tr>
       <w:tr>
         <w:tc>
+          <w:tcPr>
+            <w:tcW w:type="dxa" w:w="5074"/>
+          </w:tcPr>
           <w:p>
             <w:pPr>
               <w:pStyle w:val="Compact"/>
@@ -149,6 +195,9 @@
           </w:p>
         </w:tc>
         <w:tc>
+          <w:tcPr>
+            <w:tcW w:type="dxa" w:w="4525"/>
+          </w:tcPr>
           <w:p>
             <w:pPr>
               <w:pStyle w:val="Compact"/>
@@ -162,6 +211,9 @@
       </w:tr>
       <w:tr>
         <w:tc>
+          <w:tcPr>
+            <w:tcW w:type="dxa" w:w="5074"/>
+          </w:tcPr>
           <w:p>
             <w:pPr>
               <w:pStyle w:val="Compact"/>
@@ -173,6 +225,9 @@
           </w:p>
         </w:tc>
         <w:tc>
+          <w:tcPr>
+            <w:tcW w:type="dxa" w:w="4525"/>
+          </w:tcPr>
           <w:p>
             <w:pPr>
               <w:pStyle w:val="Compact"/>
@@ -185,20 +240,21 @@
         </w:tc>
       </w:tr>
     </w:tbl>
+    <w:bookmarkEnd w:id="20"/>
+    <w:bookmarkStart w:id="21" w:name="veri-haritası-pipeline-aşamaları"/>
     <w:p>
       <w:pPr>
         <w:pStyle w:val="Heading1"/>
       </w:pPr>
-      <w:bookmarkStart w:id="21" w:name="veri-haritası-pipeline-aşamaları"/>
       <w:r>
         <w:t xml:space="preserve">2. Veri haritası — pipeline aşamaları</w:t>
       </w:r>
-      <w:bookmarkEnd w:id="21"/>
     </w:p>
     <w:tbl>
       <w:tblPr>
         <w:tblStyle w:val="Table"/>
-        <w:tblLook w:firstRow="1"/>
+        <w:tblLook w:firstRow="1" w:lastRow="0" w:firstColumn="0" w:lastColumn="0" w:noHBand="0" w:noVBand="0" w:val="0020"/>
+        <w:jc w:val="start"/>
         <w:tblW w:w="9600" w:type="dxa"/>
         <w:tblLayout w:type="fixed"/>
         <w:tblBorders>
@@ -220,15 +276,11 @@
       </w:tblGrid>
       <w:tr>
         <w:trPr>
-          <w:cnfStyle w:firstRow="1"/>
+          <w:tblHeader w:val="true"/>
         </w:trPr>
         <w:tc>
           <w:tcPr>
             <w:tcW w:type="dxa" w:w="2598"/>
-            <w:tcBorders>
-              <w:bottom w:val="single"/>
-            </w:tcBorders>
-            <w:vAlign w:val="bottom"/>
           </w:tcPr>
           <w:p>
             <w:pPr>
@@ -243,10 +295,6 @@
         <w:tc>
           <w:tcPr>
             <w:tcW w:type="dxa" w:w="1321"/>
-            <w:tcBorders>
-              <w:bottom w:val="single"/>
-            </w:tcBorders>
-            <w:vAlign w:val="bottom"/>
           </w:tcPr>
           <w:p>
             <w:pPr>
@@ -261,10 +309,6 @@
         <w:tc>
           <w:tcPr>
             <w:tcW w:type="dxa" w:w="1321"/>
-            <w:tcBorders>
-              <w:bottom w:val="single"/>
-            </w:tcBorders>
-            <w:vAlign w:val="bottom"/>
           </w:tcPr>
           <w:p>
             <w:pPr>
@@ -279,10 +323,6 @@
         <w:tc>
           <w:tcPr>
             <w:tcW w:type="dxa" w:w="1321"/>
-            <w:tcBorders>
-              <w:bottom w:val="single"/>
-            </w:tcBorders>
-            <w:vAlign w:val="bottom"/>
           </w:tcPr>
           <w:p>
             <w:pPr>
@@ -297,10 +337,6 @@
         <w:tc>
           <w:tcPr>
             <w:tcW w:type="dxa" w:w="1321"/>
-            <w:tcBorders>
-              <w:bottom w:val="single"/>
-            </w:tcBorders>
-            <w:vAlign w:val="bottom"/>
           </w:tcPr>
           <w:p>
             <w:pPr>
@@ -315,10 +351,6 @@
         <w:tc>
           <w:tcPr>
             <w:tcW w:type="dxa" w:w="1717"/>
-            <w:tcBorders>
-              <w:bottom w:val="single"/>
-            </w:tcBorders>
-            <w:vAlign w:val="bottom"/>
           </w:tcPr>
           <w:p>
             <w:pPr>
@@ -343,6 +375,7 @@
             </w:pPr>
             <w:r>
               <w:rPr>
+                <w:bCs/>
                 <w:b/>
               </w:rPr>
               <w:t xml:space="preserve">Giriş</w:t>
@@ -359,25 +392,41 @@
           <w:tcPr>
             <w:tcW w:type="dxa" w:w="1321"/>
           </w:tcPr>
-          <w:p/>
-        </w:tc>
-        <w:tc>
-          <w:tcPr>
-            <w:tcW w:type="dxa" w:w="1321"/>
-          </w:tcPr>
-          <w:p/>
-        </w:tc>
-        <w:tc>
-          <w:tcPr>
-            <w:tcW w:type="dxa" w:w="1321"/>
-          </w:tcPr>
-          <w:p/>
-        </w:tc>
-        <w:tc>
-          <w:tcPr>
-            <w:tcW w:type="dxa" w:w="1321"/>
-          </w:tcPr>
-          <w:p/>
+          <w:p>
+            <w:pPr>
+              <w:pStyle w:val="Compact"/>
+            </w:pPr>
+          </w:p>
+        </w:tc>
+        <w:tc>
+          <w:tcPr>
+            <w:tcW w:type="dxa" w:w="1321"/>
+          </w:tcPr>
+          <w:p>
+            <w:pPr>
+              <w:pStyle w:val="Compact"/>
+            </w:pPr>
+          </w:p>
+        </w:tc>
+        <w:tc>
+          <w:tcPr>
+            <w:tcW w:type="dxa" w:w="1321"/>
+          </w:tcPr>
+          <w:p>
+            <w:pPr>
+              <w:pStyle w:val="Compact"/>
+            </w:pPr>
+          </w:p>
+        </w:tc>
+        <w:tc>
+          <w:tcPr>
+            <w:tcW w:type="dxa" w:w="1321"/>
+          </w:tcPr>
+          <w:p>
+            <w:pPr>
+              <w:pStyle w:val="Compact"/>
+            </w:pPr>
+          </w:p>
         </w:tc>
         <w:tc>
           <w:tcPr>
@@ -406,6 +455,7 @@
             </w:pPr>
             <w:r>
               <w:rPr>
+                <w:bCs/>
                 <w:b/>
               </w:rPr>
               <w:t xml:space="preserve">Depolama</w:t>
@@ -422,31 +472,51 @@
           <w:tcPr>
             <w:tcW w:type="dxa" w:w="1321"/>
           </w:tcPr>
-          <w:p/>
-        </w:tc>
-        <w:tc>
-          <w:tcPr>
-            <w:tcW w:type="dxa" w:w="1321"/>
-          </w:tcPr>
-          <w:p/>
-        </w:tc>
-        <w:tc>
-          <w:tcPr>
-            <w:tcW w:type="dxa" w:w="1321"/>
-          </w:tcPr>
-          <w:p/>
-        </w:tc>
-        <w:tc>
-          <w:tcPr>
-            <w:tcW w:type="dxa" w:w="1321"/>
-          </w:tcPr>
-          <w:p/>
+          <w:p>
+            <w:pPr>
+              <w:pStyle w:val="Compact"/>
+            </w:pPr>
+          </w:p>
+        </w:tc>
+        <w:tc>
+          <w:tcPr>
+            <w:tcW w:type="dxa" w:w="1321"/>
+          </w:tcPr>
+          <w:p>
+            <w:pPr>
+              <w:pStyle w:val="Compact"/>
+            </w:pPr>
+          </w:p>
+        </w:tc>
+        <w:tc>
+          <w:tcPr>
+            <w:tcW w:type="dxa" w:w="1321"/>
+          </w:tcPr>
+          <w:p>
+            <w:pPr>
+              <w:pStyle w:val="Compact"/>
+            </w:pPr>
+          </w:p>
+        </w:tc>
+        <w:tc>
+          <w:tcPr>
+            <w:tcW w:type="dxa" w:w="1321"/>
+          </w:tcPr>
+          <w:p>
+            <w:pPr>
+              <w:pStyle w:val="Compact"/>
+            </w:pPr>
+          </w:p>
         </w:tc>
         <w:tc>
           <w:tcPr>
             <w:tcW w:type="dxa" w:w="1717"/>
           </w:tcPr>
-          <w:p/>
+          <w:p>
+            <w:pPr>
+              <w:pStyle w:val="Compact"/>
+            </w:pPr>
+          </w:p>
         </w:tc>
       </w:tr>
       <w:tr>
@@ -461,6 +531,7 @@
             </w:pPr>
             <w:r>
               <w:rPr>
+                <w:bCs/>
                 <w:b/>
               </w:rPr>
               <w:t xml:space="preserve">Prompt</w:t>
@@ -477,25 +548,41 @@
           <w:tcPr>
             <w:tcW w:type="dxa" w:w="1321"/>
           </w:tcPr>
-          <w:p/>
-        </w:tc>
-        <w:tc>
-          <w:tcPr>
-            <w:tcW w:type="dxa" w:w="1321"/>
-          </w:tcPr>
-          <w:p/>
-        </w:tc>
-        <w:tc>
-          <w:tcPr>
-            <w:tcW w:type="dxa" w:w="1321"/>
-          </w:tcPr>
-          <w:p/>
-        </w:tc>
-        <w:tc>
-          <w:tcPr>
-            <w:tcW w:type="dxa" w:w="1321"/>
-          </w:tcPr>
-          <w:p/>
+          <w:p>
+            <w:pPr>
+              <w:pStyle w:val="Compact"/>
+            </w:pPr>
+          </w:p>
+        </w:tc>
+        <w:tc>
+          <w:tcPr>
+            <w:tcW w:type="dxa" w:w="1321"/>
+          </w:tcPr>
+          <w:p>
+            <w:pPr>
+              <w:pStyle w:val="Compact"/>
+            </w:pPr>
+          </w:p>
+        </w:tc>
+        <w:tc>
+          <w:tcPr>
+            <w:tcW w:type="dxa" w:w="1321"/>
+          </w:tcPr>
+          <w:p>
+            <w:pPr>
+              <w:pStyle w:val="Compact"/>
+            </w:pPr>
+          </w:p>
+        </w:tc>
+        <w:tc>
+          <w:tcPr>
+            <w:tcW w:type="dxa" w:w="1321"/>
+          </w:tcPr>
+          <w:p>
+            <w:pPr>
+              <w:pStyle w:val="Compact"/>
+            </w:pPr>
+          </w:p>
         </w:tc>
         <w:tc>
           <w:tcPr>
@@ -524,6 +611,7 @@
             </w:pPr>
             <w:r>
               <w:rPr>
+                <w:bCs/>
                 <w:b/>
               </w:rPr>
               <w:t xml:space="preserve">Çıkarım</w:t>
@@ -540,31 +628,51 @@
           <w:tcPr>
             <w:tcW w:type="dxa" w:w="1321"/>
           </w:tcPr>
-          <w:p/>
-        </w:tc>
-        <w:tc>
-          <w:tcPr>
-            <w:tcW w:type="dxa" w:w="1321"/>
-          </w:tcPr>
-          <w:p/>
-        </w:tc>
-        <w:tc>
-          <w:tcPr>
-            <w:tcW w:type="dxa" w:w="1321"/>
-          </w:tcPr>
-          <w:p/>
-        </w:tc>
-        <w:tc>
-          <w:tcPr>
-            <w:tcW w:type="dxa" w:w="1321"/>
-          </w:tcPr>
-          <w:p/>
+          <w:p>
+            <w:pPr>
+              <w:pStyle w:val="Compact"/>
+            </w:pPr>
+          </w:p>
+        </w:tc>
+        <w:tc>
+          <w:tcPr>
+            <w:tcW w:type="dxa" w:w="1321"/>
+          </w:tcPr>
+          <w:p>
+            <w:pPr>
+              <w:pStyle w:val="Compact"/>
+            </w:pPr>
+          </w:p>
+        </w:tc>
+        <w:tc>
+          <w:tcPr>
+            <w:tcW w:type="dxa" w:w="1321"/>
+          </w:tcPr>
+          <w:p>
+            <w:pPr>
+              <w:pStyle w:val="Compact"/>
+            </w:pPr>
+          </w:p>
+        </w:tc>
+        <w:tc>
+          <w:tcPr>
+            <w:tcW w:type="dxa" w:w="1321"/>
+          </w:tcPr>
+          <w:p>
+            <w:pPr>
+              <w:pStyle w:val="Compact"/>
+            </w:pPr>
+          </w:p>
         </w:tc>
         <w:tc>
           <w:tcPr>
             <w:tcW w:type="dxa" w:w="1717"/>
           </w:tcPr>
-          <w:p/>
+          <w:p>
+            <w:pPr>
+              <w:pStyle w:val="Compact"/>
+            </w:pPr>
+          </w:p>
         </w:tc>
       </w:tr>
       <w:tr>
@@ -579,6 +687,7 @@
             </w:pPr>
             <w:r>
               <w:rPr>
+                <w:bCs/>
                 <w:b/>
               </w:rPr>
               <w:t xml:space="preserve">Yanıt</w:t>
@@ -595,31 +704,51 @@
           <w:tcPr>
             <w:tcW w:type="dxa" w:w="1321"/>
           </w:tcPr>
-          <w:p/>
-        </w:tc>
-        <w:tc>
-          <w:tcPr>
-            <w:tcW w:type="dxa" w:w="1321"/>
-          </w:tcPr>
-          <w:p/>
-        </w:tc>
-        <w:tc>
-          <w:tcPr>
-            <w:tcW w:type="dxa" w:w="1321"/>
-          </w:tcPr>
-          <w:p/>
-        </w:tc>
-        <w:tc>
-          <w:tcPr>
-            <w:tcW w:type="dxa" w:w="1321"/>
-          </w:tcPr>
-          <w:p/>
+          <w:p>
+            <w:pPr>
+              <w:pStyle w:val="Compact"/>
+            </w:pPr>
+          </w:p>
+        </w:tc>
+        <w:tc>
+          <w:tcPr>
+            <w:tcW w:type="dxa" w:w="1321"/>
+          </w:tcPr>
+          <w:p>
+            <w:pPr>
+              <w:pStyle w:val="Compact"/>
+            </w:pPr>
+          </w:p>
+        </w:tc>
+        <w:tc>
+          <w:tcPr>
+            <w:tcW w:type="dxa" w:w="1321"/>
+          </w:tcPr>
+          <w:p>
+            <w:pPr>
+              <w:pStyle w:val="Compact"/>
+            </w:pPr>
+          </w:p>
+        </w:tc>
+        <w:tc>
+          <w:tcPr>
+            <w:tcW w:type="dxa" w:w="1321"/>
+          </w:tcPr>
+          <w:p>
+            <w:pPr>
+              <w:pStyle w:val="Compact"/>
+            </w:pPr>
+          </w:p>
         </w:tc>
         <w:tc>
           <w:tcPr>
             <w:tcW w:type="dxa" w:w="1717"/>
           </w:tcPr>
-          <w:p/>
+          <w:p>
+            <w:pPr>
+              <w:pStyle w:val="Compact"/>
+            </w:pPr>
+          </w:p>
         </w:tc>
       </w:tr>
       <w:tr>
@@ -634,6 +763,7 @@
             </w:pPr>
             <w:r>
               <w:rPr>
+                <w:bCs/>
                 <w:b/>
               </w:rPr>
               <w:t xml:space="preserve">Sonraki kullanım</w:t>
@@ -650,31 +780,51 @@
           <w:tcPr>
             <w:tcW w:type="dxa" w:w="1321"/>
           </w:tcPr>
-          <w:p/>
-        </w:tc>
-        <w:tc>
-          <w:tcPr>
-            <w:tcW w:type="dxa" w:w="1321"/>
-          </w:tcPr>
-          <w:p/>
-        </w:tc>
-        <w:tc>
-          <w:tcPr>
-            <w:tcW w:type="dxa" w:w="1321"/>
-          </w:tcPr>
-          <w:p/>
-        </w:tc>
-        <w:tc>
-          <w:tcPr>
-            <w:tcW w:type="dxa" w:w="1321"/>
-          </w:tcPr>
-          <w:p/>
+          <w:p>
+            <w:pPr>
+              <w:pStyle w:val="Compact"/>
+            </w:pPr>
+          </w:p>
+        </w:tc>
+        <w:tc>
+          <w:tcPr>
+            <w:tcW w:type="dxa" w:w="1321"/>
+          </w:tcPr>
+          <w:p>
+            <w:pPr>
+              <w:pStyle w:val="Compact"/>
+            </w:pPr>
+          </w:p>
+        </w:tc>
+        <w:tc>
+          <w:tcPr>
+            <w:tcW w:type="dxa" w:w="1321"/>
+          </w:tcPr>
+          <w:p>
+            <w:pPr>
+              <w:pStyle w:val="Compact"/>
+            </w:pPr>
+          </w:p>
+        </w:tc>
+        <w:tc>
+          <w:tcPr>
+            <w:tcW w:type="dxa" w:w="1321"/>
+          </w:tcPr>
+          <w:p>
+            <w:pPr>
+              <w:pStyle w:val="Compact"/>
+            </w:pPr>
+          </w:p>
         </w:tc>
         <w:tc>
           <w:tcPr>
             <w:tcW w:type="dxa" w:w="1717"/>
           </w:tcPr>
-          <w:p/>
+          <w:p>
+            <w:pPr>
+              <w:pStyle w:val="Compact"/>
+            </w:pPr>
+          </w:p>
         </w:tc>
       </w:tr>
       <w:tr>
@@ -689,6 +839,7 @@
             </w:pPr>
             <w:r>
               <w:rPr>
+                <w:bCs/>
                 <w:b/>
               </w:rPr>
               <w:t xml:space="preserve">Kayıtlar</w:t>
@@ -705,48 +856,69 @@
           <w:tcPr>
             <w:tcW w:type="dxa" w:w="1321"/>
           </w:tcPr>
-          <w:p/>
-        </w:tc>
-        <w:tc>
-          <w:tcPr>
-            <w:tcW w:type="dxa" w:w="1321"/>
-          </w:tcPr>
-          <w:p/>
-        </w:tc>
-        <w:tc>
-          <w:tcPr>
-            <w:tcW w:type="dxa" w:w="1321"/>
-          </w:tcPr>
-          <w:p/>
-        </w:tc>
-        <w:tc>
-          <w:tcPr>
-            <w:tcW w:type="dxa" w:w="1321"/>
-          </w:tcPr>
-          <w:p/>
+          <w:p>
+            <w:pPr>
+              <w:pStyle w:val="Compact"/>
+            </w:pPr>
+          </w:p>
+        </w:tc>
+        <w:tc>
+          <w:tcPr>
+            <w:tcW w:type="dxa" w:w="1321"/>
+          </w:tcPr>
+          <w:p>
+            <w:pPr>
+              <w:pStyle w:val="Compact"/>
+            </w:pPr>
+          </w:p>
+        </w:tc>
+        <w:tc>
+          <w:tcPr>
+            <w:tcW w:type="dxa" w:w="1321"/>
+          </w:tcPr>
+          <w:p>
+            <w:pPr>
+              <w:pStyle w:val="Compact"/>
+            </w:pPr>
+          </w:p>
+        </w:tc>
+        <w:tc>
+          <w:tcPr>
+            <w:tcW w:type="dxa" w:w="1321"/>
+          </w:tcPr>
+          <w:p>
+            <w:pPr>
+              <w:pStyle w:val="Compact"/>
+            </w:pPr>
+          </w:p>
         </w:tc>
         <w:tc>
           <w:tcPr>
             <w:tcW w:type="dxa" w:w="1717"/>
           </w:tcPr>
-          <w:p/>
+          <w:p>
+            <w:pPr>
+              <w:pStyle w:val="Compact"/>
+            </w:pPr>
+          </w:p>
         </w:tc>
       </w:tr>
     </w:tbl>
+    <w:bookmarkEnd w:id="21"/>
+    <w:bookmarkStart w:id="22" w:name="yurt-dışı-aktarım-noktaları"/>
     <w:p>
       <w:pPr>
         <w:pStyle w:val="Heading1"/>
       </w:pPr>
-      <w:bookmarkStart w:id="22" w:name="yurt-dışı-aktarım-noktaları"/>
       <w:r>
         <w:t xml:space="preserve">3. Yurt dışı aktarım noktaları</w:t>
       </w:r>
-      <w:bookmarkEnd w:id="22"/>
     </w:p>
     <w:tbl>
       <w:tblPr>
         <w:tblStyle w:val="Table"/>
-        <w:tblLook w:firstRow="1"/>
+        <w:tblLook w:firstRow="1" w:lastRow="0" w:firstColumn="0" w:lastColumn="0" w:noHBand="0" w:noVBand="0" w:val="0020"/>
+        <w:jc w:val="start"/>
         <w:tblW w:w="9600" w:type="dxa"/>
         <w:tblLayout w:type="fixed"/>
         <w:tblBorders>
@@ -758,17 +930,20 @@
           <w:insideV w:val="single" w:sz="4" w:color="8A9BB0"/>
         </w:tblBorders>
       </w:tblPr>
-      <w:tblGrid/>
+      <w:tblGrid>
+        <w:gridCol w:w="1907"/>
+        <w:gridCol w:w="1970"/>
+        <w:gridCol w:w="1907"/>
+        <w:gridCol w:w="1907"/>
+        <w:gridCol w:w="1907"/>
+      </w:tblGrid>
       <w:tr>
         <w:trPr>
-          <w:cnfStyle w:firstRow="1"/>
+          <w:tblHeader w:val="true"/>
         </w:trPr>
         <w:tc>
           <w:tcPr>
-            <w:tcBorders>
-              <w:bottom w:val="single"/>
-            </w:tcBorders>
-            <w:vAlign w:val="bottom"/>
+            <w:tcW w:type="dxa" w:w="1907"/>
           </w:tcPr>
           <w:p>
             <w:pPr>
@@ -782,10 +957,7 @@
         </w:tc>
         <w:tc>
           <w:tcPr>
-            <w:tcBorders>
-              <w:bottom w:val="single"/>
-            </w:tcBorders>
-            <w:vAlign w:val="bottom"/>
+            <w:tcW w:type="dxa" w:w="1970"/>
           </w:tcPr>
           <w:p>
             <w:pPr>
@@ -799,10 +971,7 @@
         </w:tc>
         <w:tc>
           <w:tcPr>
-            <w:tcBorders>
-              <w:bottom w:val="single"/>
-            </w:tcBorders>
-            <w:vAlign w:val="bottom"/>
+            <w:tcW w:type="dxa" w:w="1907"/>
           </w:tcPr>
           <w:p>
             <w:pPr>
@@ -816,10 +985,7 @@
         </w:tc>
         <w:tc>
           <w:tcPr>
-            <w:tcBorders>
-              <w:bottom w:val="single"/>
-            </w:tcBorders>
-            <w:vAlign w:val="bottom"/>
+            <w:tcW w:type="dxa" w:w="1907"/>
           </w:tcPr>
           <w:p>
             <w:pPr>
@@ -833,10 +999,7 @@
         </w:tc>
         <w:tc>
           <w:tcPr>
-            <w:tcBorders>
-              <w:bottom w:val="single"/>
-            </w:tcBorders>
-            <w:vAlign w:val="bottom"/>
+            <w:tcW w:type="dxa" w:w="1907"/>
           </w:tcPr>
           <w:p>
             <w:pPr>
@@ -851,36 +1014,72 @@
       </w:tr>
       <w:tr>
         <w:tc>
-          <w:p/>
-        </w:tc>
-        <w:tc>
-          <w:p/>
-        </w:tc>
-        <w:tc>
-          <w:p/>
-        </w:tc>
-        <w:tc>
-          <w:p/>
-        </w:tc>
-        <w:tc>
-          <w:p/>
+          <w:tcPr>
+            <w:tcW w:type="dxa" w:w="1907"/>
+          </w:tcPr>
+          <w:p>
+            <w:pPr>
+              <w:pStyle w:val="Compact"/>
+            </w:pPr>
+          </w:p>
+        </w:tc>
+        <w:tc>
+          <w:tcPr>
+            <w:tcW w:type="dxa" w:w="1970"/>
+          </w:tcPr>
+          <w:p>
+            <w:pPr>
+              <w:pStyle w:val="Compact"/>
+            </w:pPr>
+          </w:p>
+        </w:tc>
+        <w:tc>
+          <w:tcPr>
+            <w:tcW w:type="dxa" w:w="1907"/>
+          </w:tcPr>
+          <w:p>
+            <w:pPr>
+              <w:pStyle w:val="Compact"/>
+            </w:pPr>
+          </w:p>
+        </w:tc>
+        <w:tc>
+          <w:tcPr>
+            <w:tcW w:type="dxa" w:w="1907"/>
+          </w:tcPr>
+          <w:p>
+            <w:pPr>
+              <w:pStyle w:val="Compact"/>
+            </w:pPr>
+          </w:p>
+        </w:tc>
+        <w:tc>
+          <w:tcPr>
+            <w:tcW w:type="dxa" w:w="1907"/>
+          </w:tcPr>
+          <w:p>
+            <w:pPr>
+              <w:pStyle w:val="Compact"/>
+            </w:pPr>
+          </w:p>
         </w:tc>
       </w:tr>
     </w:tbl>
+    <w:bookmarkEnd w:id="22"/>
+    <w:bookmarkStart w:id="23" w:name="Xc444d750b2ac03b943845c84a02fe3092dbd777"/>
     <w:p>
       <w:pPr>
         <w:pStyle w:val="Heading1"/>
       </w:pPr>
-      <w:bookmarkStart w:id="23" w:name="Xc444d750b2ac03b943845c84a02fe3092dbd777"/>
       <w:r>
         <w:t xml:space="preserve">4. Hukuki değerlendirme (hukuk danışmanı doldurur)</w:t>
       </w:r>
-      <w:bookmarkEnd w:id="23"/>
     </w:p>
     <w:tbl>
       <w:tblPr>
         <w:tblStyle w:val="Table"/>
-        <w:tblLook w:firstRow="0"/>
+        <w:tblLook w:firstRow="0" w:lastRow="0" w:firstColumn="0" w:lastColumn="0" w:noHBand="0" w:noVBand="0" w:val="0000"/>
+        <w:jc w:val="start"/>
         <w:tblW w:w="9600" w:type="dxa"/>
         <w:tblLayout w:type="fixed"/>
         <w:tblBorders>
@@ -892,9 +1091,15 @@
           <w:insideV w:val="single" w:sz="4" w:color="8A9BB0"/>
         </w:tblBorders>
       </w:tblPr>
-      <w:tblGrid/>
+      <w:tblGrid>
+        <w:gridCol w:w="6327"/>
+        <w:gridCol w:w="3272"/>
+      </w:tblGrid>
       <w:tr>
         <w:tc>
+          <w:tcPr>
+            <w:tcW w:type="dxa" w:w="6327"/>
+          </w:tcPr>
           <w:p>
             <w:pPr>
               <w:pStyle w:val="Compact"/>
@@ -906,11 +1111,21 @@
           </w:p>
         </w:tc>
         <w:tc>
-          <w:p/>
+          <w:tcPr>
+            <w:tcW w:type="dxa" w:w="3272"/>
+          </w:tcPr>
+          <w:p>
+            <w:pPr>
+              <w:pStyle w:val="Compact"/>
+            </w:pPr>
+          </w:p>
         </w:tc>
       </w:tr>
       <w:tr>
         <w:tc>
+          <w:tcPr>
+            <w:tcW w:type="dxa" w:w="6327"/>
+          </w:tcPr>
           <w:p>
             <w:pPr>
               <w:pStyle w:val="Compact"/>
@@ -922,11 +1137,21 @@
           </w:p>
         </w:tc>
         <w:tc>
-          <w:p/>
+          <w:tcPr>
+            <w:tcW w:type="dxa" w:w="3272"/>
+          </w:tcPr>
+          <w:p>
+            <w:pPr>
+              <w:pStyle w:val="Compact"/>
+            </w:pPr>
+          </w:p>
         </w:tc>
       </w:tr>
       <w:tr>
         <w:tc>
+          <w:tcPr>
+            <w:tcW w:type="dxa" w:w="6327"/>
+          </w:tcPr>
           <w:p>
             <w:pPr>
               <w:pStyle w:val="Compact"/>
@@ -938,11 +1163,21 @@
           </w:p>
         </w:tc>
         <w:tc>
-          <w:p/>
+          <w:tcPr>
+            <w:tcW w:type="dxa" w:w="3272"/>
+          </w:tcPr>
+          <w:p>
+            <w:pPr>
+              <w:pStyle w:val="Compact"/>
+            </w:pPr>
+          </w:p>
         </w:tc>
       </w:tr>
       <w:tr>
         <w:tc>
+          <w:tcPr>
+            <w:tcW w:type="dxa" w:w="6327"/>
+          </w:tcPr>
           <w:p>
             <w:pPr>
               <w:pStyle w:val="Compact"/>
@@ -954,24 +1189,32 @@
           </w:p>
         </w:tc>
         <w:tc>
-          <w:p/>
+          <w:tcPr>
+            <w:tcW w:type="dxa" w:w="3272"/>
+          </w:tcPr>
+          <w:p>
+            <w:pPr>
+              <w:pStyle w:val="Compact"/>
+            </w:pPr>
+          </w:p>
         </w:tc>
       </w:tr>
     </w:tbl>
+    <w:bookmarkEnd w:id="23"/>
+    <w:bookmarkStart w:id="24" w:name="riskler-ve-önlemler"/>
     <w:p>
       <w:pPr>
         <w:pStyle w:val="Heading1"/>
       </w:pPr>
-      <w:bookmarkStart w:id="24" w:name="riskler-ve-önlemler"/>
       <w:r>
         <w:t xml:space="preserve">5. Riskler ve önlemler</w:t>
       </w:r>
-      <w:bookmarkEnd w:id="24"/>
     </w:p>
     <w:tbl>
       <w:tblPr>
         <w:tblStyle w:val="Table"/>
-        <w:tblLook w:firstRow="1"/>
+        <w:tblLook w:firstRow="1" w:lastRow="0" w:firstColumn="0" w:lastColumn="0" w:noHBand="0" w:noVBand="0" w:val="0020"/>
+        <w:jc w:val="start"/>
         <w:tblW w:w="9600" w:type="dxa"/>
         <w:tblLayout w:type="fixed"/>
         <w:tblBorders>
@@ -983,17 +1226,22 @@
           <w:insideV w:val="single" w:sz="4" w:color="8A9BB0"/>
         </w:tblBorders>
       </w:tblPr>
-      <w:tblGrid/>
+      <w:tblGrid>
+        <w:gridCol w:w="600"/>
+        <w:gridCol w:w="2571"/>
+        <w:gridCol w:w="1285"/>
+        <w:gridCol w:w="1285"/>
+        <w:gridCol w:w="1285"/>
+        <w:gridCol w:w="1285"/>
+        <w:gridCol w:w="1285"/>
+      </w:tblGrid>
       <w:tr>
         <w:trPr>
-          <w:cnfStyle w:firstRow="1"/>
+          <w:tblHeader w:val="true"/>
         </w:trPr>
         <w:tc>
           <w:tcPr>
-            <w:tcBorders>
-              <w:bottom w:val="single"/>
-            </w:tcBorders>
-            <w:vAlign w:val="bottom"/>
+            <w:tcW w:type="dxa" w:w="600"/>
           </w:tcPr>
           <w:p>
             <w:pPr>
@@ -1007,10 +1255,7 @@
         </w:tc>
         <w:tc>
           <w:tcPr>
-            <w:tcBorders>
-              <w:bottom w:val="single"/>
-            </w:tcBorders>
-            <w:vAlign w:val="bottom"/>
+            <w:tcW w:type="dxa" w:w="2571"/>
           </w:tcPr>
           <w:p>
             <w:pPr>
@@ -1024,10 +1269,7 @@
         </w:tc>
         <w:tc>
           <w:tcPr>
-            <w:tcBorders>
-              <w:bottom w:val="single"/>
-            </w:tcBorders>
-            <w:vAlign w:val="bottom"/>
+            <w:tcW w:type="dxa" w:w="1285"/>
           </w:tcPr>
           <w:p>
             <w:pPr>
@@ -1041,10 +1283,7 @@
         </w:tc>
         <w:tc>
           <w:tcPr>
-            <w:tcBorders>
-              <w:bottom w:val="single"/>
-            </w:tcBorders>
-            <w:vAlign w:val="bottom"/>
+            <w:tcW w:type="dxa" w:w="1285"/>
           </w:tcPr>
           <w:p>
             <w:pPr>
@@ -1058,10 +1297,7 @@
         </w:tc>
         <w:tc>
           <w:tcPr>
-            <w:tcBorders>
-              <w:bottom w:val="single"/>
-            </w:tcBorders>
-            <w:vAlign w:val="bottom"/>
+            <w:tcW w:type="dxa" w:w="1285"/>
           </w:tcPr>
           <w:p>
             <w:pPr>
@@ -1075,10 +1311,7 @@
         </w:tc>
         <w:tc>
           <w:tcPr>
-            <w:tcBorders>
-              <w:bottom w:val="single"/>
-            </w:tcBorders>
-            <w:vAlign w:val="bottom"/>
+            <w:tcW w:type="dxa" w:w="1285"/>
           </w:tcPr>
           <w:p>
             <w:pPr>
@@ -1092,10 +1325,7 @@
         </w:tc>
         <w:tc>
           <w:tcPr>
-            <w:tcBorders>
-              <w:bottom w:val="single"/>
-            </w:tcBorders>
-            <w:vAlign w:val="bottom"/>
+            <w:tcW w:type="dxa" w:w="1285"/>
           </w:tcPr>
           <w:p>
             <w:pPr>
@@ -1110,6 +1340,9 @@
       </w:tr>
       <w:tr>
         <w:tc>
+          <w:tcPr>
+            <w:tcW w:type="dxa" w:w="600"/>
+          </w:tcPr>
           <w:p>
             <w:pPr>
               <w:pStyle w:val="Compact"/>
@@ -1121,6 +1354,9 @@
           </w:p>
         </w:tc>
         <w:tc>
+          <w:tcPr>
+            <w:tcW w:type="dxa" w:w="2571"/>
+          </w:tcPr>
           <w:p>
             <w:pPr>
               <w:pStyle w:val="Compact"/>
@@ -1132,23 +1368,61 @@
           </w:p>
         </w:tc>
         <w:tc>
-          <w:p/>
-        </w:tc>
-        <w:tc>
-          <w:p/>
-        </w:tc>
-        <w:tc>
-          <w:p/>
-        </w:tc>
-        <w:tc>
-          <w:p/>
-        </w:tc>
-        <w:tc>
-          <w:p/>
+          <w:tcPr>
+            <w:tcW w:type="dxa" w:w="1285"/>
+          </w:tcPr>
+          <w:p>
+            <w:pPr>
+              <w:pStyle w:val="Compact"/>
+            </w:pPr>
+          </w:p>
+        </w:tc>
+        <w:tc>
+          <w:tcPr>
+            <w:tcW w:type="dxa" w:w="1285"/>
+          </w:tcPr>
+          <w:p>
+            <w:pPr>
+              <w:pStyle w:val="Compact"/>
+            </w:pPr>
+          </w:p>
+        </w:tc>
+        <w:tc>
+          <w:tcPr>
+            <w:tcW w:type="dxa" w:w="1285"/>
+          </w:tcPr>
+          <w:p>
+            <w:pPr>
+              <w:pStyle w:val="Compact"/>
+            </w:pPr>
+          </w:p>
+        </w:tc>
+        <w:tc>
+          <w:tcPr>
+            <w:tcW w:type="dxa" w:w="1285"/>
+          </w:tcPr>
+          <w:p>
+            <w:pPr>
+              <w:pStyle w:val="Compact"/>
+            </w:pPr>
+          </w:p>
+        </w:tc>
+        <w:tc>
+          <w:tcPr>
+            <w:tcW w:type="dxa" w:w="1285"/>
+          </w:tcPr>
+          <w:p>
+            <w:pPr>
+              <w:pStyle w:val="Compact"/>
+            </w:pPr>
+          </w:p>
         </w:tc>
       </w:tr>
       <w:tr>
         <w:tc>
+          <w:tcPr>
+            <w:tcW w:type="dxa" w:w="600"/>
+          </w:tcPr>
           <w:p>
             <w:pPr>
               <w:pStyle w:val="Compact"/>
@@ -1160,6 +1434,9 @@
           </w:p>
         </w:tc>
         <w:tc>
+          <w:tcPr>
+            <w:tcW w:type="dxa" w:w="2571"/>
+          </w:tcPr>
           <w:p>
             <w:pPr>
               <w:pStyle w:val="Compact"/>
@@ -1171,23 +1448,61 @@
           </w:p>
         </w:tc>
         <w:tc>
-          <w:p/>
-        </w:tc>
-        <w:tc>
-          <w:p/>
-        </w:tc>
-        <w:tc>
-          <w:p/>
-        </w:tc>
-        <w:tc>
-          <w:p/>
-        </w:tc>
-        <w:tc>
-          <w:p/>
+          <w:tcPr>
+            <w:tcW w:type="dxa" w:w="1285"/>
+          </w:tcPr>
+          <w:p>
+            <w:pPr>
+              <w:pStyle w:val="Compact"/>
+            </w:pPr>
+          </w:p>
+        </w:tc>
+        <w:tc>
+          <w:tcPr>
+            <w:tcW w:type="dxa" w:w="1285"/>
+          </w:tcPr>
+          <w:p>
+            <w:pPr>
+              <w:pStyle w:val="Compact"/>
+            </w:pPr>
+          </w:p>
+        </w:tc>
+        <w:tc>
+          <w:tcPr>
+            <w:tcW w:type="dxa" w:w="1285"/>
+          </w:tcPr>
+          <w:p>
+            <w:pPr>
+              <w:pStyle w:val="Compact"/>
+            </w:pPr>
+          </w:p>
+        </w:tc>
+        <w:tc>
+          <w:tcPr>
+            <w:tcW w:type="dxa" w:w="1285"/>
+          </w:tcPr>
+          <w:p>
+            <w:pPr>
+              <w:pStyle w:val="Compact"/>
+            </w:pPr>
+          </w:p>
+        </w:tc>
+        <w:tc>
+          <w:tcPr>
+            <w:tcW w:type="dxa" w:w="1285"/>
+          </w:tcPr>
+          <w:p>
+            <w:pPr>
+              <w:pStyle w:val="Compact"/>
+            </w:pPr>
+          </w:p>
         </w:tc>
       </w:tr>
       <w:tr>
         <w:tc>
+          <w:tcPr>
+            <w:tcW w:type="dxa" w:w="600"/>
+          </w:tcPr>
           <w:p>
             <w:pPr>
               <w:pStyle w:val="Compact"/>
@@ -1199,6 +1514,9 @@
           </w:p>
         </w:tc>
         <w:tc>
+          <w:tcPr>
+            <w:tcW w:type="dxa" w:w="2571"/>
+          </w:tcPr>
           <w:p>
             <w:pPr>
               <w:pStyle w:val="Compact"/>
@@ -1210,23 +1528,61 @@
           </w:p>
         </w:tc>
         <w:tc>
-          <w:p/>
-        </w:tc>
-        <w:tc>
-          <w:p/>
-        </w:tc>
-        <w:tc>
-          <w:p/>
-        </w:tc>
-        <w:tc>
-          <w:p/>
-        </w:tc>
-        <w:tc>
-          <w:p/>
+          <w:tcPr>
+            <w:tcW w:type="dxa" w:w="1285"/>
+          </w:tcPr>
+          <w:p>
+            <w:pPr>
+              <w:pStyle w:val="Compact"/>
+            </w:pPr>
+          </w:p>
+        </w:tc>
+        <w:tc>
+          <w:tcPr>
+            <w:tcW w:type="dxa" w:w="1285"/>
+          </w:tcPr>
+          <w:p>
+            <w:pPr>
+              <w:pStyle w:val="Compact"/>
+            </w:pPr>
+          </w:p>
+        </w:tc>
+        <w:tc>
+          <w:tcPr>
+            <w:tcW w:type="dxa" w:w="1285"/>
+          </w:tcPr>
+          <w:p>
+            <w:pPr>
+              <w:pStyle w:val="Compact"/>
+            </w:pPr>
+          </w:p>
+        </w:tc>
+        <w:tc>
+          <w:tcPr>
+            <w:tcW w:type="dxa" w:w="1285"/>
+          </w:tcPr>
+          <w:p>
+            <w:pPr>
+              <w:pStyle w:val="Compact"/>
+            </w:pPr>
+          </w:p>
+        </w:tc>
+        <w:tc>
+          <w:tcPr>
+            <w:tcW w:type="dxa" w:w="1285"/>
+          </w:tcPr>
+          <w:p>
+            <w:pPr>
+              <w:pStyle w:val="Compact"/>
+            </w:pPr>
+          </w:p>
         </w:tc>
       </w:tr>
       <w:tr>
         <w:tc>
+          <w:tcPr>
+            <w:tcW w:type="dxa" w:w="600"/>
+          </w:tcPr>
           <w:p>
             <w:pPr>
               <w:pStyle w:val="Compact"/>
@@ -1238,6 +1594,9 @@
           </w:p>
         </w:tc>
         <w:tc>
+          <w:tcPr>
+            <w:tcW w:type="dxa" w:w="2571"/>
+          </w:tcPr>
           <w:p>
             <w:pPr>
               <w:pStyle w:val="Compact"/>
@@ -1249,36 +1608,72 @@
           </w:p>
         </w:tc>
         <w:tc>
-          <w:p/>
-        </w:tc>
-        <w:tc>
-          <w:p/>
-        </w:tc>
-        <w:tc>
-          <w:p/>
-        </w:tc>
-        <w:tc>
-          <w:p/>
-        </w:tc>
-        <w:tc>
-          <w:p/>
+          <w:tcPr>
+            <w:tcW w:type="dxa" w:w="1285"/>
+          </w:tcPr>
+          <w:p>
+            <w:pPr>
+              <w:pStyle w:val="Compact"/>
+            </w:pPr>
+          </w:p>
+        </w:tc>
+        <w:tc>
+          <w:tcPr>
+            <w:tcW w:type="dxa" w:w="1285"/>
+          </w:tcPr>
+          <w:p>
+            <w:pPr>
+              <w:pStyle w:val="Compact"/>
+            </w:pPr>
+          </w:p>
+        </w:tc>
+        <w:tc>
+          <w:tcPr>
+            <w:tcW w:type="dxa" w:w="1285"/>
+          </w:tcPr>
+          <w:p>
+            <w:pPr>
+              <w:pStyle w:val="Compact"/>
+            </w:pPr>
+          </w:p>
+        </w:tc>
+        <w:tc>
+          <w:tcPr>
+            <w:tcW w:type="dxa" w:w="1285"/>
+          </w:tcPr>
+          <w:p>
+            <w:pPr>
+              <w:pStyle w:val="Compact"/>
+            </w:pPr>
+          </w:p>
+        </w:tc>
+        <w:tc>
+          <w:tcPr>
+            <w:tcW w:type="dxa" w:w="1285"/>
+          </w:tcPr>
+          <w:p>
+            <w:pPr>
+              <w:pStyle w:val="Compact"/>
+            </w:pPr>
+          </w:p>
         </w:tc>
       </w:tr>
     </w:tbl>
+    <w:bookmarkEnd w:id="24"/>
+    <w:bookmarkStart w:id="25" w:name="dpo-görüşü-ve-karar"/>
     <w:p>
       <w:pPr>
         <w:pStyle w:val="Heading1"/>
       </w:pPr>
-      <w:bookmarkStart w:id="25" w:name="dpo-görüşü-ve-karar"/>
       <w:r>
         <w:t xml:space="preserve">6. DPO görüşü ve karar</w:t>
       </w:r>
-      <w:bookmarkEnd w:id="25"/>
     </w:p>
     <w:tbl>
       <w:tblPr>
         <w:tblStyle w:val="Table"/>
-        <w:tblLook w:firstRow="0"/>
+        <w:tblLook w:firstRow="0" w:lastRow="0" w:firstColumn="0" w:lastColumn="0" w:noHBand="0" w:noVBand="0" w:val="0000"/>
+        <w:jc w:val="start"/>
         <w:tblW w:w="9600" w:type="dxa"/>
         <w:tblLayout w:type="fixed"/>
         <w:tblBorders>
@@ -1313,7 +1708,11 @@
           <w:tcPr>
             <w:tcW w:type="dxa" w:w="6260"/>
           </w:tcPr>
-          <w:p/>
+          <w:p>
+            <w:pPr>
+              <w:pStyle w:val="Compact"/>
+            </w:pPr>
+          </w:p>
         </w:tc>
       </w:tr>
       <w:tr>
@@ -1335,7 +1734,11 @@
           <w:tcPr>
             <w:tcW w:type="dxa" w:w="6260"/>
           </w:tcPr>
-          <w:p/>
+          <w:p>
+            <w:pPr>
+              <w:pStyle w:val="Compact"/>
+            </w:pPr>
+          </w:p>
         </w:tc>
       </w:tr>
       <w:tr>
@@ -1399,6 +1802,7 @@
         </w:tc>
       </w:tr>
     </w:tbl>
+    <w:bookmarkEnd w:id="25"/>
     <w:sectPr/>
   </w:body>
 </w:document>
@@ -1430,17 +1834,14 @@
 <file path=word/numbering.xml><?xml version="1.0" encoding="utf-8"?>
 <w:numbering xmlns:w="http://schemas.openxmlformats.org/wordprocessingml/2006/main">
   <w:abstractNum w:abstractNumId="990">
-    <w:nsid w:val="2c1ae401"/>
+    <w:nsid w:val="A990"/>
     <w:multiLevelType w:val="multilevel"/>
     <w:lvl w:ilvl="0">
       <w:numFmt w:val="bullet"/>
       <w:lvlText w:val=" "/>
       <w:lvlJc w:val="left"/>
       <w:pPr>
-        <w:tabs>
-          <w:tab w:val="num" w:pos="0"/>
-        </w:tabs>
-        <w:ind w:left="480" w:hanging="480"/>
+        <w:ind w:left="720" w:hanging="480"/>
       </w:pPr>
     </w:lvl>
     <w:lvl w:ilvl="1">
@@ -1448,10 +1849,7 @@
       <w:lvlText w:val=" "/>
       <w:lvlJc w:val="left"/>
       <w:pPr>
-        <w:tabs>
-          <w:tab w:val="num" w:pos="720"/>
-        </w:tabs>
-        <w:ind w:left="1200" w:hanging="480"/>
+        <w:ind w:left="1440" w:hanging="480"/>
       </w:pPr>
     </w:lvl>
     <w:lvl w:ilvl="2">
@@ -1459,10 +1857,7 @@
       <w:lvlText w:val=" "/>
       <w:lvlJc w:val="left"/>
       <w:pPr>
-        <w:tabs>
-          <w:tab w:val="num" w:pos="1440"/>
-        </w:tabs>
-        <w:ind w:left="1920" w:hanging="480"/>
+        <w:ind w:left="2160" w:hanging="480"/>
       </w:pPr>
     </w:lvl>
     <w:lvl w:ilvl="3">
@@ -1470,10 +1865,7 @@
       <w:lvlText w:val=" "/>
       <w:lvlJc w:val="left"/>
       <w:pPr>
-        <w:tabs>
-          <w:tab w:val="num" w:pos="2160"/>
-        </w:tabs>
-        <w:ind w:left="2640" w:hanging="480"/>
+        <w:ind w:left="2880" w:hanging="480"/>
       </w:pPr>
     </w:lvl>
     <w:lvl w:ilvl="4">
@@ -1481,10 +1873,7 @@
       <w:lvlText w:val=" "/>
       <w:lvlJc w:val="left"/>
       <w:pPr>
-        <w:tabs>
-          <w:tab w:val="num" w:pos="2880"/>
-        </w:tabs>
-        <w:ind w:left="3360" w:hanging="480"/>
+        <w:ind w:left="3600" w:hanging="480"/>
       </w:pPr>
     </w:lvl>
     <w:lvl w:ilvl="5">
@@ -1492,10 +1881,7 @@
       <w:lvlText w:val=" "/>
       <w:lvlJc w:val="left"/>
       <w:pPr>
-        <w:tabs>
-          <w:tab w:val="num" w:pos="3600"/>
-        </w:tabs>
-        <w:ind w:left="4080" w:hanging="480"/>
+        <w:ind w:left="4320" w:hanging="480"/>
       </w:pPr>
     </w:lvl>
     <w:lvl w:ilvl="6">
@@ -1503,10 +1889,7 @@
       <w:lvlText w:val=" "/>
       <w:lvlJc w:val="left"/>
       <w:pPr>
-        <w:tabs>
-          <w:tab w:val="num" w:pos="4320"/>
-        </w:tabs>
-        <w:ind w:left="4800" w:hanging="480"/>
+        <w:ind w:left="5040" w:hanging="480"/>
       </w:pPr>
     </w:lvl>
     <w:lvl w:ilvl="7">
@@ -1514,10 +1897,7 @@
       <w:lvlText w:val=" "/>
       <w:lvlJc w:val="left"/>
       <w:pPr>
-        <w:tabs>
-          <w:tab w:val="num" w:pos="5040"/>
-        </w:tabs>
-        <w:ind w:left="5520" w:hanging="480"/>
+        <w:ind w:left="5760" w:hanging="480"/>
       </w:pPr>
     </w:lvl>
     <w:lvl w:ilvl="8">
@@ -1525,10 +1905,7 @@
       <w:lvlText w:val=" "/>
       <w:lvlJc w:val="left"/>
       <w:pPr>
-        <w:tabs>
-          <w:tab w:val="num" w:pos="5760"/>
-        </w:tabs>
-        <w:ind w:left="6240" w:hanging="480"/>
+        <w:ind w:left="6480" w:hanging="480"/>
       </w:pPr>
     </w:lvl>
   </w:abstractNum>
@@ -1543,10 +1920,10 @@
   <w:docDefaults>
     <w:rPrDefault>
       <w:rPr>
-        <w:rFonts w:asciiTheme="minorHAnsi" w:eastAsiaTheme="minorHAnsi" w:hAnsiTheme="minorHAnsi" w:cstheme="minorBidi"/>
+        <w:rFonts w:asciiTheme="minorHAnsi" w:cstheme="minorBidi" w:eastAsiaTheme="minorHAnsi" w:hAnsiTheme="minorHAnsi"/>
         <w:sz w:val="24"/>
         <w:szCs w:val="24"/>
-        <w:lang w:val="en-US" w:eastAsia="en-US" w:bidi="ar-SA"/>
+        <w:lang w:bidi="ar-SA" w:eastAsia="en-US" w:val="en-US"/>
       </w:rPr>
     </w:rPrDefault>
     <w:pPrDefault>
@@ -1555,8 +1932,8 @@
       </w:pPr>
     </w:pPrDefault>
   </w:docDefaults>
-  <w:latentStyles w:defLockedState="0" w:defUIPriority="0" w:defSemiHidden="0" w:defUnhideWhenUsed="0" w:defQFormat="0" w:count="276"/>
-  <w:style w:type="paragraph" w:default="1" w:styleId="Normal">
+  <w:latentStyles w:count="276" w:defLockedState="0" w:defQFormat="0" w:defSemiHidden="0" w:defUIPriority="0" w:defUnhideWhenUsed="0"/>
+  <w:style w:default="1" w:styleId="Normal" w:type="paragraph">
     <w:name w:val="Normal"/>
     <w:qFormat/>
     <w:rPr>
@@ -1564,12 +1941,12 @@
       <w:sz w:val="21"/>
     </w:rPr>
   </w:style>
-  <w:style w:type="paragraph" w:styleId="BodyText">
+  <w:style w:styleId="BodyText" w:type="paragraph">
     <w:name w:val="Body Text"/>
     <w:basedOn w:val="Normal"/>
     <w:link w:val="BodyTextChar"/>
     <w:pPr>
-      <w:spacing w:before="180" w:after="180"/>
+      <w:spacing w:after="180" w:before="180"/>
     </w:pPr>
     <w:qFormat/>
     <w:rPr>
@@ -1577,7 +1954,7 @@
       <w:sz w:val="21"/>
     </w:rPr>
   </w:style>
-  <w:style w:type="paragraph" w:customStyle="1" w:styleId="FirstParagraph">
+  <w:style w:customStyle="1" w:styleId="FirstParagraph" w:type="paragraph">
     <w:name w:val="First Paragraph"/>
     <w:basedOn w:val="BodyText"/>
     <w:next w:val="BodyText"/>
@@ -1587,19 +1964,19 @@
       <w:sz w:val="21"/>
     </w:rPr>
   </w:style>
-  <w:style w:type="paragraph" w:customStyle="1" w:styleId="Compact">
+  <w:style w:customStyle="1" w:styleId="Compact" w:type="paragraph">
     <w:name w:val="Compact"/>
     <w:basedOn w:val="BodyText"/>
     <w:qFormat/>
     <w:pPr>
-      <w:spacing w:before="36" w:after="36"/>
+      <w:spacing w:after="36" w:before="36"/>
     </w:pPr>
     <w:rPr>
       <w:rFonts w:ascii="Calibri" w:hAnsi="Calibri"/>
       <w:sz w:val="21"/>
     </w:rPr>
   </w:style>
-  <w:style w:type="paragraph" w:styleId="Title">
+  <w:style w:styleId="Title" w:type="paragraph">
     <w:name w:val="Title"/>
     <w:basedOn w:val="Normal"/>
     <w:next w:val="BodyText"/>
@@ -1607,11 +1984,11 @@
     <w:pPr>
       <w:keepNext/>
       <w:keepLines/>
-      <w:spacing w:before="480" w:after="240"/>
+      <w:spacing w:after="240" w:before="480"/>
       <w:jc w:val="center"/>
     </w:pPr>
     <w:rPr>
-      <w:rFonts w:asciiTheme="majorHAnsi" w:eastAsiaTheme="majorEastAsia" w:hAnsiTheme="majorHAnsi" w:cstheme="majorBidi" w:ascii="Calibri" w:hAnsi="Calibri"/>
+      <w:rFonts w:ascii="Calibri" w:asciiTheme="majorHAnsi" w:cstheme="majorBidi" w:eastAsiaTheme="majorEastAsia" w:hAnsi="Calibri" w:hAnsiTheme="majorHAnsi"/>
       <w:b/>
       <w:bCs/>
       <w:color w:val="1F3A5F"/>
@@ -1619,7 +1996,7 @@
       <w:szCs w:val="36"/>
     </w:rPr>
   </w:style>
-  <w:style w:type="paragraph" w:styleId="Subtitle">
+  <w:style w:styleId="Subtitle" w:type="paragraph">
     <w:name w:val="Subtitle"/>
     <w:basedOn w:val="Title"/>
     <w:next w:val="BodyText"/>
@@ -1627,7 +2004,7 @@
     <w:pPr>
       <w:keepNext/>
       <w:keepLines/>
-      <w:spacing w:before="240" w:after="240"/>
+      <w:spacing w:after="240" w:before="240"/>
       <w:jc w:val="center"/>
     </w:pPr>
     <w:rPr>
@@ -1635,7 +2012,7 @@
       <w:szCs w:val="30"/>
     </w:rPr>
   </w:style>
-  <w:style w:type="paragraph" w:customStyle="1" w:styleId="Author">
+  <w:style w:customStyle="1" w:styleId="Author" w:type="paragraph">
     <w:name w:val="Author"/>
     <w:next w:val="BodyText"/>
     <w:qFormat/>
@@ -1645,7 +2022,7 @@
       <w:jc w:val="center"/>
     </w:pPr>
   </w:style>
-  <w:style w:type="paragraph" w:styleId="Date">
+  <w:style w:styleId="Date" w:type="paragraph">
     <w:name w:val="Date"/>
     <w:next w:val="BodyText"/>
     <w:qFormat/>
@@ -1655,7 +2032,7 @@
       <w:jc w:val="center"/>
     </w:pPr>
   </w:style>
-  <w:style w:type="paragraph" w:customStyle="1" w:styleId="Abstract">
+  <w:style w:customStyle="1" w:styleId="Abstract" w:type="paragraph">
     <w:name w:val="Abstract"/>
     <w:basedOn w:val="Normal"/>
     <w:next w:val="BodyText"/>
@@ -1663,14 +2040,14 @@
     <w:pPr>
       <w:keepNext/>
       <w:keepLines/>
-      <w:spacing w:before="300" w:after="300"/>
+      <w:spacing w:after="300" w:before="300"/>
     </w:pPr>
     <w:rPr>
       <w:sz w:val="20"/>
       <w:szCs w:val="20"/>
     </w:rPr>
   </w:style>
-  <w:style w:type="paragraph" w:styleId="Bibliography">
+  <w:style w:styleId="Bibliography" w:type="paragraph">
     <w:name w:val="Bibliography"/>
     <w:basedOn w:val="Normal"/>
     <w:next w:val="Bibliography"/>
@@ -1678,7 +2055,7 @@
     <w:pPr/>
     <w:rPr/>
   </w:style>
-  <w:style w:type="paragraph" w:styleId="Heading1">
+  <w:style w:styleId="Heading1" w:type="paragraph">
     <w:name w:val="Heading 1"/>
     <w:basedOn w:val="Normal"/>
     <w:next w:val="BodyText"/>
@@ -1687,11 +2064,11 @@
     <w:pPr>
       <w:keepNext/>
       <w:keepLines/>
-      <w:spacing w:before="480" w:after="0"/>
+      <w:spacing w:after="0" w:before="480"/>
       <w:outlineLvl w:val="0"/>
     </w:pPr>
     <w:rPr>
-      <w:rFonts w:asciiTheme="majorHAnsi" w:eastAsiaTheme="majorEastAsia" w:hAnsiTheme="majorHAnsi" w:cstheme="majorBidi" w:ascii="Calibri" w:hAnsi="Calibri"/>
+      <w:rFonts w:ascii="Calibri" w:asciiTheme="majorHAnsi" w:cstheme="majorBidi" w:eastAsiaTheme="majorEastAsia" w:hAnsi="Calibri" w:hAnsiTheme="majorHAnsi"/>
       <w:b/>
       <w:bCs/>
       <w:color w:val="1F3A5F"/>
@@ -1699,7 +2076,7 @@
       <w:szCs w:val="32"/>
     </w:rPr>
   </w:style>
-  <w:style w:type="paragraph" w:styleId="Heading2">
+  <w:style w:styleId="Heading2" w:type="paragraph">
     <w:name w:val="Heading 2"/>
     <w:basedOn w:val="Normal"/>
     <w:next w:val="BodyText"/>
@@ -1709,11 +2086,11 @@
     <w:pPr>
       <w:keepNext/>
       <w:keepLines/>
-      <w:spacing w:before="200" w:after="0"/>
+      <w:spacing w:after="0" w:before="200"/>
       <w:outlineLvl w:val="1"/>
     </w:pPr>
     <w:rPr>
-      <w:rFonts w:asciiTheme="majorHAnsi" w:eastAsiaTheme="majorEastAsia" w:hAnsiTheme="majorHAnsi" w:cstheme="majorBidi" w:ascii="Calibri" w:hAnsi="Calibri"/>
+      <w:rFonts w:ascii="Calibri" w:asciiTheme="majorHAnsi" w:cstheme="majorBidi" w:eastAsiaTheme="majorEastAsia" w:hAnsi="Calibri" w:hAnsiTheme="majorHAnsi"/>
       <w:b/>
       <w:bCs/>
       <w:color w:val="1F3A5F"/>
@@ -1721,7 +2098,7 @@
       <w:szCs w:val="28"/>
     </w:rPr>
   </w:style>
-  <w:style w:type="paragraph" w:styleId="Heading3">
+  <w:style w:styleId="Heading3" w:type="paragraph">
     <w:name w:val="Heading 3"/>
     <w:basedOn w:val="Normal"/>
     <w:next w:val="BodyText"/>
@@ -1731,11 +2108,11 @@
     <w:pPr>
       <w:keepNext/>
       <w:keepLines/>
-      <w:spacing w:before="200" w:after="0"/>
+      <w:spacing w:after="0" w:before="200"/>
       <w:outlineLvl w:val="2"/>
     </w:pPr>
     <w:rPr>
-      <w:rFonts w:asciiTheme="majorHAnsi" w:eastAsiaTheme="majorEastAsia" w:hAnsiTheme="majorHAnsi" w:cstheme="majorBidi" w:ascii="Calibri" w:hAnsi="Calibri"/>
+      <w:rFonts w:ascii="Calibri" w:asciiTheme="majorHAnsi" w:cstheme="majorBidi" w:eastAsiaTheme="majorEastAsia" w:hAnsi="Calibri" w:hAnsiTheme="majorHAnsi"/>
       <w:b/>
       <w:bCs/>
       <w:color w:val="1F3A5F"/>
@@ -1743,7 +2120,7 @@
       <w:szCs w:val="24"/>
     </w:rPr>
   </w:style>
-  <w:style w:type="paragraph" w:styleId="Heading4">
+  <w:style w:styleId="Heading4" w:type="paragraph">
     <w:name w:val="Heading 4"/>
     <w:basedOn w:val="Normal"/>
     <w:next w:val="BodyText"/>
@@ -1753,11 +2130,11 @@
     <w:pPr>
       <w:keepNext/>
       <w:keepLines/>
-      <w:spacing w:before="200" w:after="0"/>
+      <w:spacing w:after="0" w:before="200"/>
       <w:outlineLvl w:val="3"/>
     </w:pPr>
     <w:rPr>
-      <w:rFonts w:asciiTheme="majorHAnsi" w:eastAsiaTheme="majorEastAsia" w:hAnsiTheme="majorHAnsi" w:cstheme="majorBidi" w:ascii="Calibri" w:hAnsi="Calibri"/>
+      <w:rFonts w:ascii="Calibri" w:asciiTheme="majorHAnsi" w:cstheme="majorBidi" w:eastAsiaTheme="majorEastAsia" w:hAnsi="Calibri" w:hAnsiTheme="majorHAnsi"/>
       <w:i/>
       <w:bCs/>
       <w:color w:val="1F3A5F"/>
@@ -1765,7 +2142,7 @@
       <w:szCs w:val="24"/>
     </w:rPr>
   </w:style>
-  <w:style w:type="paragraph" w:styleId="Heading5">
+  <w:style w:styleId="Heading5" w:type="paragraph">
     <w:name w:val="Heading 5"/>
     <w:basedOn w:val="Normal"/>
     <w:next w:val="BodyText"/>
@@ -1775,18 +2152,18 @@
     <w:pPr>
       <w:keepNext/>
       <w:keepLines/>
-      <w:spacing w:before="200" w:after="0"/>
+      <w:spacing w:after="0" w:before="200"/>
       <w:outlineLvl w:val="4"/>
     </w:pPr>
     <w:rPr>
-      <w:rFonts w:asciiTheme="majorHAnsi" w:eastAsiaTheme="majorEastAsia" w:hAnsiTheme="majorHAnsi" w:cstheme="majorBidi" w:ascii="Calibri" w:hAnsi="Calibri"/>
+      <w:rFonts w:ascii="Calibri" w:asciiTheme="majorHAnsi" w:cstheme="majorBidi" w:eastAsiaTheme="majorEastAsia" w:hAnsi="Calibri" w:hAnsiTheme="majorHAnsi"/>
       <w:iCs/>
       <w:color w:val="1F3A5F"/>
       <w:sz w:val="24"/>
       <w:szCs w:val="24"/>
     </w:rPr>
   </w:style>
-  <w:style w:type="paragraph" w:styleId="Heading6">
+  <w:style w:styleId="Heading6" w:type="paragraph">
     <w:name w:val="Heading 6"/>
     <w:basedOn w:val="Normal"/>
     <w:next w:val="BodyText"/>
@@ -1796,17 +2173,17 @@
     <w:pPr>
       <w:keepNext/>
       <w:keepLines/>
-      <w:spacing w:before="200" w:after="0"/>
+      <w:spacing w:after="0" w:before="200"/>
       <w:outlineLvl w:val="5"/>
     </w:pPr>
     <w:rPr>
-      <w:rFonts w:asciiTheme="majorHAnsi" w:eastAsiaTheme="majorEastAsia" w:hAnsiTheme="majorHAnsi" w:cstheme="majorBidi" w:ascii="Calibri" w:hAnsi="Calibri"/>
+      <w:rFonts w:ascii="Calibri" w:asciiTheme="majorHAnsi" w:cstheme="majorBidi" w:eastAsiaTheme="majorEastAsia" w:hAnsi="Calibri" w:hAnsiTheme="majorHAnsi"/>
       <w:color w:val="1F3A5F"/>
       <w:sz w:val="24"/>
       <w:szCs w:val="24"/>
     </w:rPr>
   </w:style>
-  <w:style w:type="paragraph" w:styleId="Heading7">
+  <w:style w:styleId="Heading7" w:type="paragraph">
     <w:name w:val="Heading 7"/>
     <w:basedOn w:val="Normal"/>
     <w:next w:val="BodyText"/>
@@ -1816,17 +2193,17 @@
     <w:pPr>
       <w:keepNext/>
       <w:keepLines/>
-      <w:spacing w:before="200" w:after="0"/>
+      <w:spacing w:after="0" w:before="200"/>
       <w:outlineLvl w:val="6"/>
     </w:pPr>
     <w:rPr>
-      <w:rFonts w:asciiTheme="majorHAnsi" w:eastAsiaTheme="majorEastAsia" w:hAnsiTheme="majorHAnsi" w:cstheme="majorBidi" w:ascii="Calibri" w:hAnsi="Calibri"/>
+      <w:rFonts w:ascii="Calibri" w:asciiTheme="majorHAnsi" w:cstheme="majorBidi" w:eastAsiaTheme="majorEastAsia" w:hAnsi="Calibri" w:hAnsiTheme="majorHAnsi"/>
       <w:color w:val="1F3A5F"/>
       <w:sz w:val="24"/>
       <w:szCs w:val="24"/>
     </w:rPr>
   </w:style>
-  <w:style w:type="paragraph" w:styleId="Heading8">
+  <w:style w:styleId="Heading8" w:type="paragraph">
     <w:name w:val="Heading 8"/>
     <w:basedOn w:val="Normal"/>
     <w:next w:val="BodyText"/>
@@ -1836,17 +2213,17 @@
     <w:pPr>
       <w:keepNext/>
       <w:keepLines/>
-      <w:spacing w:before="200" w:after="0"/>
+      <w:spacing w:after="0" w:before="200"/>
       <w:outlineLvl w:val="7"/>
     </w:pPr>
     <w:rPr>
-      <w:rFonts w:asciiTheme="majorHAnsi" w:eastAsiaTheme="majorEastAsia" w:hAnsiTheme="majorHAnsi" w:cstheme="majorBidi" w:ascii="Calibri" w:hAnsi="Calibri"/>
+      <w:rFonts w:ascii="Calibri" w:asciiTheme="majorHAnsi" w:cstheme="majorBidi" w:eastAsiaTheme="majorEastAsia" w:hAnsi="Calibri" w:hAnsiTheme="majorHAnsi"/>
       <w:color w:val="1F3A5F"/>
       <w:sz w:val="24"/>
       <w:szCs w:val="24"/>
     </w:rPr>
   </w:style>
-  <w:style w:type="paragraph" w:styleId="Heading9">
+  <w:style w:styleId="Heading9" w:type="paragraph">
     <w:name w:val="Heading 9"/>
     <w:basedOn w:val="Normal"/>
     <w:next w:val="BodyText"/>
@@ -1856,17 +2233,17 @@
     <w:pPr>
       <w:keepNext/>
       <w:keepLines/>
-      <w:spacing w:before="200" w:after="0"/>
+      <w:spacing w:after="0" w:before="200"/>
       <w:outlineLvl w:val="8"/>
     </w:pPr>
     <w:rPr>
-      <w:rFonts w:asciiTheme="majorHAnsi" w:eastAsiaTheme="majorEastAsia" w:hAnsiTheme="majorHAnsi" w:cstheme="majorBidi" w:ascii="Calibri" w:hAnsi="Calibri"/>
+      <w:rFonts w:ascii="Calibri" w:asciiTheme="majorHAnsi" w:cstheme="majorBidi" w:eastAsiaTheme="majorEastAsia" w:hAnsi="Calibri" w:hAnsiTheme="majorHAnsi"/>
       <w:color w:val="1F3A5F"/>
       <w:sz w:val="24"/>
       <w:szCs w:val="24"/>
     </w:rPr>
   </w:style>
-  <w:style w:type="paragraph" w:styleId="BlockText">
+  <w:style w:styleId="BlockText" w:type="paragraph">
     <w:name w:val="Block Text"/>
     <w:basedOn w:val="BodyText"/>
     <w:next w:val="BodyText"/>
@@ -1874,7 +2251,7 @@
     <w:unhideWhenUsed/>
     <w:qFormat/>
     <w:pPr>
-      <w:spacing w:before="100" w:after="100"/>
+      <w:spacing w:after="100" w:before="100"/>
       <w:ind w:firstLine="0" w:left="480" w:right="480"/>
     </w:pPr>
     <w:rPr>
@@ -1882,7 +2259,7 @@
       <w:sz w:val="21"/>
     </w:rPr>
   </w:style>
-  <w:style w:type="paragraph" w:styleId="FootnoteText">
+  <w:style w:styleId="FootnoteText" w:type="paragraph">
     <w:name w:val="Footnote Text"/>
     <w:basedOn w:val="Normal"/>
     <w:next w:val="FootnoteText"/>
@@ -1890,12 +2267,12 @@
     <w:unhideWhenUsed/>
     <w:qFormat/>
   </w:style>
-  <w:style w:type="character" w:default="1" w:styleId="DefaultParagraphFont">
+  <w:style w:default="1" w:styleId="DefaultParagraphFont" w:type="character">
     <w:name w:val="Default Paragraph Font"/>
     <w:semiHidden/>
     <w:unhideWhenUsed/>
   </w:style>
-  <w:style w:type="table" w:default="1" w:styleId="Table">
+  <w:style w:default="1" w:styleId="Table" w:type="table">
     <w:name w:val="Table"/>
     <w:basedOn w:val="TableNormal"/>
     <w:semiHidden/>
@@ -1906,16 +2283,16 @@
       <w:sz w:val="21"/>
     </w:rPr>
     <w:tblPr>
-      <w:tblInd w:w="0" w:type="dxa"/>
+      <w:tblInd w:type="dxa" w:w="0"/>
       <w:tblCellMar>
-        <w:top w:w="0" w:type="dxa"/>
-        <w:left w:w="108" w:type="dxa"/>
-        <w:bottom w:w="0" w:type="dxa"/>
-        <w:right w:w="108" w:type="dxa"/>
+        <w:top w:type="dxa" w:w="0"/>
+        <w:left w:type="dxa" w:w="108"/>
+        <w:bottom w:type="dxa" w:w="0"/>
+        <w:right w:type="dxa" w:w="108"/>
       </w:tblCellMar>
     </w:tblPr>
   </w:style>
-  <w:style w:type="paragraph" w:customStyle="1" w:styleId="DefinitionTerm">
+  <w:style w:customStyle="1" w:styleId="DefinitionTerm" w:type="paragraph">
     <w:name w:val="Definition Term"/>
     <w:basedOn w:val="Normal"/>
     <w:next w:val="Definition"/>
@@ -1928,49 +2305,49 @@
       <w:b/>
     </w:rPr>
   </w:style>
-  <w:style w:type="paragraph" w:customStyle="1" w:styleId="Definition">
+  <w:style w:customStyle="1" w:styleId="Definition" w:type="paragraph">
     <w:name w:val="Definition"/>
     <w:basedOn w:val="Normal"/>
   </w:style>
-  <w:style w:type="paragraph" w:styleId="Caption">
+  <w:style w:styleId="Caption" w:type="paragraph">
     <w:name w:val="Caption"/>
     <w:basedOn w:val="Normal"/>
     <w:link w:val="BodyTextChar"/>
     <w:pPr>
-      <w:spacing w:before="0" w:after="120"/>
+      <w:spacing w:after="120" w:before="0"/>
     </w:pPr>
     <w:rPr>
       <w:i/>
     </w:rPr>
   </w:style>
-  <w:style w:type="paragraph" w:customStyle="1" w:styleId="TableCaption">
+  <w:style w:customStyle="1" w:styleId="TableCaption" w:type="paragraph">
     <w:name w:val="Table Caption"/>
     <w:basedOn w:val="Caption"/>
     <w:pPr>
       <w:keepNext/>
     </w:pPr>
   </w:style>
-  <w:style w:type="paragraph" w:customStyle="1" w:styleId="ImageCaption">
+  <w:style w:customStyle="1" w:styleId="ImageCaption" w:type="paragraph">
     <w:name w:val="Image Caption"/>
     <w:basedOn w:val="Caption"/>
   </w:style>
-  <w:style w:type="paragraph" w:customStyle="1" w:styleId="Figure">
+  <w:style w:customStyle="1" w:styleId="Figure" w:type="paragraph">
     <w:name w:val="Figure"/>
     <w:basedOn w:val="Normal"/>
   </w:style>
-  <w:style w:type="paragraph" w:customStyle="1" w:styleId="CaptionedFigure">
+  <w:style w:customStyle="1" w:styleId="CaptionedFigure" w:type="paragraph">
     <w:name w:val="Captioned Figure"/>
     <w:basedOn w:val="Figure"/>
     <w:pPr>
       <w:keepNext/>
     </w:pPr>
   </w:style>
-  <w:style w:type="character" w:customStyle="1" w:styleId="BodyTextChar">
+  <w:style w:customStyle="1" w:styleId="BodyTextChar" w:type="character">
     <w:name w:val="Body Text Char"/>
     <w:basedOn w:val="DefaultParagraphFont"/>
     <w:link w:val="BodyText"/>
   </w:style>
-  <w:style w:type="character" w:customStyle="1" w:styleId="VerbatimChar">
+  <w:style w:customStyle="1" w:styleId="VerbatimChar" w:type="character">
     <w:name w:val="Verbatim Char"/>
     <w:basedOn w:val="BodyTextChar"/>
     <w:rPr>
@@ -1978,21 +2355,21 @@
       <w:sz w:val="22"/>
     </w:rPr>
   </w:style>
-  <w:style w:type="character" w:styleId="FootnoteReference">
+  <w:style w:styleId="FootnoteReference" w:type="character">
     <w:name w:val="Footnote Reference"/>
     <w:basedOn w:val="BodyTextChar"/>
     <w:rPr>
       <w:vertAlign w:val="superscript"/>
     </w:rPr>
   </w:style>
-  <w:style w:type="character" w:styleId="Hyperlink">
+  <w:style w:styleId="Hyperlink" w:type="character">
     <w:name w:val="Hyperlink"/>
     <w:basedOn w:val="BodyTextChar"/>
     <w:rPr>
-      <w:color w:val="4F81BD" w:themeColor="accent1"/>
-    </w:rPr>
-  </w:style>
-  <w:style w:type="paragraph" w:styleId="TOCHeading">
+      <w:color w:themeColor="accent1" w:val="4F81BD"/>
+    </w:rPr>
+  </w:style>
+  <w:style w:styleId="TOCHeading" w:type="paragraph">
     <w:name w:val="TOC Heading"/>
     <w:basedOn w:val="Heading1"/>
     <w:next w:val="BodyText"/>
@@ -2004,10 +2381,10 @@
       <w:outlineLvl w:val="9"/>
     </w:pPr>
     <w:rPr>
-      <w:rFonts w:asciiTheme="majorHAnsi" w:eastAsiaTheme="majorEastAsia" w:hAnsiTheme="majorHAnsi" w:cstheme="majorBidi"/>
+      <w:rFonts w:asciiTheme="majorHAnsi" w:cstheme="majorBidi" w:eastAsiaTheme="majorEastAsia" w:hAnsiTheme="majorHAnsi"/>
       <w:b w:val="0"/>
       <w:bCs w:val="0"/>
-      <w:color w:val="365F91" w:themeColor="accent1" w:themeShade="BF"/>
+      <w:color w:themeColor="accent1" w:themeShade="BF" w:val="365F91"/>
     </w:rPr>
   </w:style>
   <w:style w:type="paragraph" w:customStyle="1" w:styleId="SourceCode">
@@ -2099,7 +2476,10 @@
   <w:style w:type="character" w:customStyle="1" w:styleId="ImportTok">
     <w:name w:val="ImportTok"/>
     <w:basedOn w:val="VerbatimChar"/>
-    <w:rPr/>
+    <w:rPr>
+      <w:color w:val="008000"/>
+      <w:b/>
+    </w:rPr>
   </w:style>
   <w:style w:type="character" w:customStyle="1" w:styleId="CommentTok">
     <w:name w:val="CommentTok"/>
@@ -2174,7 +2554,9 @@
   <w:style w:type="character" w:customStyle="1" w:styleId="BuiltInTok">
     <w:name w:val="BuiltInTok"/>
     <w:basedOn w:val="VerbatimChar"/>
-    <w:rPr/>
+    <w:rPr>
+      <w:color w:val="008000"/>
+    </w:rPr>
   </w:style>
   <w:style w:type="character" w:customStyle="1" w:styleId="ExtensionTok">
     <w:name w:val="ExtensionTok"/>

</xml_diff>